<commit_message>
vault backup: 2026-07-18 22:17:16
</commit_message>
<xml_diff>
--- a/Kỹ thuật Phục hồi chức năng/01. Môn học Cơ sở (II.1)/MH09. Hóa sinh/Đề cương /1. GLUCID.docx
+++ b/Kỹ thuật Phục hồi chức năng/01. Môn học Cơ sở (II.1)/MH09. Hóa sinh/Đề cương /1. GLUCID.docx
@@ -11427,7 +11427,6 @@
         <w:rPr>
           <w:szCs w:val="28"/>
           <w:highlight w:val="yellow"/>
-          <w:lang w:val="en-US"/>
         </w:rPr>
       </w:r>
       <w:r>
@@ -13682,7 +13681,6 @@
           <w:bCs/>
           <w:iCs/>
           <w:szCs w:val="28"/>
-          <w:highlight w:val="yellow"/>
         </w:rPr>
       </w:r>
       <w:r>
@@ -14315,7 +14313,6 @@
       <w:r>
         <w:rPr>
           <w:szCs w:val="28"/>
-          <w:highlight w:val="yellow"/>
           <w:lang w:val="en-US"/>
         </w:rPr>
       </w:r>
@@ -15289,7 +15286,21 @@
           <w:lang w:val="en-US"/>
         </w:rPr>
         <w:tab/>
-        <w:t xml:space="preserve">B. (1) Giai đoạn 1, (2) Oxi hóa </w:t>
+      </w:r>
+      <w:r>
+        <w:rPr>
+          <w:szCs w:val="28"/>
+          <w:highlight w:val="yellow"/>
+          <w:lang w:val="en-US"/>
+        </w:rPr>
+        <w:t xml:space="preserve">B. (1) Giai đoạn 1, (2) Oxi hóa</w:t>
+      </w:r>
+      <w:r>
+        <w:rPr>
+          <w:szCs w:val="28"/>
+          <w:lang w:val="en-US"/>
+        </w:rPr>
+        <w:t xml:space="preserve"> </w:t>
       </w:r>
       <w:r>
         <w:rPr>
@@ -15565,6 +15576,13 @@
           <w:lang w:val="en-US"/>
         </w:rPr>
         <w:tab/>
+      </w:r>
+      <w:r>
+        <w:rPr>
+          <w:szCs w:val="28"/>
+          <w:highlight w:val="yellow"/>
+          <w:lang w:val="en-US"/>
+        </w:rPr>
         <w:t xml:space="preserve">B. (2) Không oxi hóa, (2) Ribose-5P</w:t>
       </w:r>
       <w:r>
@@ -17270,12 +17288,21 @@
           <w:lang w:val="en-US"/>
         </w:rPr>
         <w:tab/>
+      </w:r>
+      <w:r>
+        <w:rPr>
+          <w:rFonts w:cs="Times New Roman"/>
+          <w:szCs w:val="28"/>
+          <w:highlight w:val="yellow"/>
+          <w:lang w:val="en-US"/>
+        </w:rPr>
         <w:t xml:space="preserve">C</w:t>
       </w:r>
       <w:r>
         <w:rPr>
           <w:rFonts w:cs="Times New Roman"/>
           <w:szCs w:val="28"/>
+          <w:highlight w:val="yellow"/>
         </w:rPr>
         <w:t xml:space="preserve">. &lt;2%</w:t>
       </w:r>
@@ -17425,6 +17452,7 @@
         <w:rPr>
           <w:rFonts w:cs="Times New Roman"/>
           <w:szCs w:val="28"/>
+          <w:highlight w:val="yellow"/>
         </w:rPr>
         <w:t xml:space="preserve">C. pH 8</w:t>
       </w:r>
@@ -17669,12 +17697,14 @@
         <w:rPr>
           <w:rFonts w:cs="Times New Roman"/>
           <w:szCs w:val="28"/>
-        </w:rPr>
-      </w:pPr>
-      <w:r>
-        <w:rPr>
-          <w:rFonts w:cs="Times New Roman"/>
-          <w:szCs w:val="28"/>
+          <w:highlight w:val="yellow"/>
+        </w:rPr>
+      </w:pPr>
+      <w:r>
+        <w:rPr>
+          <w:rFonts w:cs="Times New Roman"/>
+          <w:szCs w:val="28"/>
+          <w:highlight w:val="yellow"/>
         </w:rPr>
         <w:t xml:space="preserve">D. A và C đúng</w:t>
       </w:r>
@@ -17682,12 +17712,14 @@
         <w:rPr>
           <w:rFonts w:cs="Times New Roman"/>
           <w:szCs w:val="28"/>
-        </w:rPr>
-      </w:r>
-      <w:r>
-        <w:rPr>
-          <w:rFonts w:cs="Times New Roman"/>
-          <w:szCs w:val="28"/>
+          <w:highlight w:val="yellow"/>
+        </w:rPr>
+      </w:r>
+      <w:r>
+        <w:rPr>
+          <w:rFonts w:cs="Times New Roman"/>
+          <w:szCs w:val="28"/>
+          <w:highlight w:val="yellow"/>
         </w:rPr>
       </w:r>
     </w:p>
@@ -17912,13 +17944,15 @@
           <w:rFonts w:cs="Times New Roman"/>
           <w:bCs/>
           <w:szCs w:val="28"/>
-        </w:rPr>
-      </w:pPr>
-      <w:r>
-        <w:rPr>
-          <w:rFonts w:cs="Times New Roman"/>
-          <w:bCs/>
-          <w:szCs w:val="28"/>
+          <w:highlight w:val="yellow"/>
+        </w:rPr>
+      </w:pPr>
+      <w:r>
+        <w:rPr>
+          <w:rFonts w:cs="Times New Roman"/>
+          <w:bCs/>
+          <w:szCs w:val="28"/>
+          <w:highlight w:val="yellow"/>
         </w:rPr>
         <w:t xml:space="preserve">D. A và B đúng</w:t>
       </w:r>
@@ -17927,13 +17961,15 @@
           <w:rFonts w:cs="Times New Roman"/>
           <w:bCs/>
           <w:szCs w:val="28"/>
-        </w:rPr>
-      </w:r>
-      <w:r>
-        <w:rPr>
-          <w:rFonts w:cs="Times New Roman"/>
-          <w:bCs/>
-          <w:szCs w:val="28"/>
+          <w:highlight w:val="yellow"/>
+        </w:rPr>
+      </w:r>
+      <w:r>
+        <w:rPr>
+          <w:rFonts w:cs="Times New Roman"/>
+          <w:bCs/>
+          <w:szCs w:val="28"/>
+          <w:highlight w:val="yellow"/>
         </w:rPr>
       </w:r>
     </w:p>
@@ -18057,12 +18093,14 @@
         <w:rPr>
           <w:rFonts w:cs="Times New Roman"/>
           <w:szCs w:val="28"/>
-        </w:rPr>
-      </w:pPr>
-      <w:r>
-        <w:rPr>
-          <w:rFonts w:cs="Times New Roman"/>
-          <w:szCs w:val="28"/>
+          <w:highlight w:val="none"/>
+        </w:rPr>
+      </w:pPr>
+      <w:r>
+        <w:rPr>
+          <w:rFonts w:cs="Times New Roman"/>
+          <w:szCs w:val="28"/>
+          <w:highlight w:val="none"/>
         </w:rPr>
         <w:t xml:space="preserve">B. Acetyl CoA đi vào chu trình Krebs tạo 38 ATP</w:t>
       </w:r>
@@ -18070,12 +18108,14 @@
         <w:rPr>
           <w:rFonts w:cs="Times New Roman"/>
           <w:szCs w:val="28"/>
-        </w:rPr>
-      </w:r>
-      <w:r>
-        <w:rPr>
-          <w:rFonts w:cs="Times New Roman"/>
-          <w:szCs w:val="28"/>
+          <w:highlight w:val="none"/>
+        </w:rPr>
+      </w:r>
+      <w:r>
+        <w:rPr>
+          <w:rFonts w:cs="Times New Roman"/>
+          <w:szCs w:val="28"/>
+          <w:highlight w:val="none"/>
         </w:rPr>
       </w:r>
     </w:p>
@@ -18096,12 +18136,14 @@
         <w:rPr>
           <w:rFonts w:cs="Times New Roman"/>
           <w:szCs w:val="28"/>
-        </w:rPr>
-      </w:pPr>
-      <w:r>
-        <w:rPr>
-          <w:rFonts w:cs="Times New Roman"/>
-          <w:szCs w:val="28"/>
+          <w:highlight w:val="yellow"/>
+        </w:rPr>
+      </w:pPr>
+      <w:r>
+        <w:rPr>
+          <w:rFonts w:cs="Times New Roman"/>
+          <w:szCs w:val="28"/>
+          <w:highlight w:val="yellow"/>
         </w:rPr>
         <w:t xml:space="preserve">C. CO</w:t>
       </w:r>
@@ -18109,6 +18151,7 @@
         <w:rPr>
           <w:rFonts w:cs="Times New Roman"/>
           <w:szCs w:val="28"/>
+          <w:highlight w:val="yellow"/>
           <w:vertAlign w:val="subscript"/>
         </w:rPr>
         <w:t xml:space="preserve">2</w:t>
@@ -18117,6 +18160,7 @@
         <w:rPr>
           <w:rFonts w:cs="Times New Roman"/>
           <w:szCs w:val="28"/>
+          <w:highlight w:val="yellow"/>
         </w:rPr>
         <w:t xml:space="preserve"> và H</w:t>
       </w:r>
@@ -18124,6 +18168,7 @@
         <w:rPr>
           <w:rFonts w:cs="Times New Roman"/>
           <w:szCs w:val="28"/>
+          <w:highlight w:val="yellow"/>
           <w:vertAlign w:val="subscript"/>
         </w:rPr>
         <w:t xml:space="preserve">2</w:t>
@@ -18132,6 +18177,7 @@
         <w:rPr>
           <w:rFonts w:cs="Times New Roman"/>
           <w:szCs w:val="28"/>
+          <w:highlight w:val="yellow"/>
         </w:rPr>
         <w:t xml:space="preserve">O</w:t>
       </w:r>
@@ -18139,12 +18185,14 @@
         <w:rPr>
           <w:rFonts w:cs="Times New Roman"/>
           <w:szCs w:val="28"/>
-        </w:rPr>
-      </w:r>
-      <w:r>
-        <w:rPr>
-          <w:rFonts w:cs="Times New Roman"/>
-          <w:szCs w:val="28"/>
+          <w:highlight w:val="yellow"/>
+        </w:rPr>
+      </w:r>
+      <w:r>
+        <w:rPr>
+          <w:rFonts w:cs="Times New Roman"/>
+          <w:szCs w:val="28"/>
+          <w:highlight w:val="yellow"/>
         </w:rPr>
       </w:r>
     </w:p>
@@ -18274,6 +18322,7 @@
         <w:rPr>
           <w:rFonts w:cs="Times New Roman"/>
           <w:szCs w:val="28"/>
+          <w:highlight w:val="yellow"/>
         </w:rPr>
         <w:t xml:space="preserve">A. Glucose và các MS khác</w:t>
       </w:r>
@@ -18450,6 +18499,7 @@
           <w:bCs/>
           <w:iCs/>
           <w:szCs w:val="28"/>
+          <w:highlight w:val="yellow"/>
         </w:rPr>
         <w:t xml:space="preserve">A. Insulin</w:t>
       </w:r>
@@ -18775,6 +18825,7 @@
           <w:bCs/>
           <w:iCs/>
           <w:szCs w:val="28"/>
+          <w:highlight w:val="yellow"/>
         </w:rPr>
       </w:pPr>
       <w:r>
@@ -18783,6 +18834,7 @@
           <w:bCs/>
           <w:iCs/>
           <w:szCs w:val="28"/>
+          <w:highlight w:val="yellow"/>
         </w:rPr>
         <w:t xml:space="preserve">D. Cả A, B và C đều đúng</w:t>
       </w:r>
@@ -18792,6 +18844,7 @@
           <w:bCs/>
           <w:iCs/>
           <w:szCs w:val="28"/>
+          <w:highlight w:val="yellow"/>
         </w:rPr>
       </w:r>
       <w:r>
@@ -18800,6 +18853,7 @@
           <w:bCs/>
           <w:iCs/>
           <w:szCs w:val="28"/>
+          <w:highlight w:val="yellow"/>
         </w:rPr>
       </w:r>
     </w:p>

</xml_diff>

<commit_message>
vault backup: 2026-07-19 11:31:48
</commit_message>
<xml_diff>
--- a/Kỹ thuật Phục hồi chức năng/01. Môn học Cơ sở (II.1)/MH09. Hóa sinh/Đề cương /1. GLUCID.docx
+++ b/Kỹ thuật Phục hồi chức năng/01. Môn học Cơ sở (II.1)/MH09. Hóa sinh/Đề cương /1. GLUCID.docx
@@ -12930,7 +12930,8 @@
       <w:r>
         <w:rPr>
           <w:rFonts w:cs="Times New Roman"/>
-          <w:bCs/>
+          <w:b w:val="0"/>
+          <w:bCs w:val="0"/>
           <w:szCs w:val="28"/>
           <w:lang w:val="fr-FR"/>
         </w:rPr>
@@ -16090,7 +16091,7 @@
         <w:ind w:firstLine="0"/>
         <w:rPr>
           <w:szCs w:val="28"/>
-          <w:lang w:val="en-US"/>
+          <w:highlight w:val="yellow"/>
         </w:rPr>
       </w:pPr>
       <w:r>
@@ -16099,17 +16100,26 @@
           <w:lang w:val="en-US"/>
         </w:rPr>
         <w:tab/>
+      </w:r>
+      <w:r>
+        <w:rPr>
+          <w:szCs w:val="28"/>
+          <w:highlight w:val="yellow"/>
+          <w:lang w:val="en-US"/>
+        </w:rPr>
         <w:t xml:space="preserve">E. Tất cả đều sai</w:t>
       </w:r>
       <w:r>
         <w:rPr>
           <w:szCs w:val="28"/>
-          <w:lang w:val="en-US"/>
-        </w:rPr>
-      </w:r>
-      <w:r>
-        <w:rPr>
-          <w:szCs w:val="28"/>
+          <w:highlight w:val="yellow"/>
+          <w:lang w:val="en-US"/>
+        </w:rPr>
+      </w:r>
+      <w:r>
+        <w:rPr>
+          <w:szCs w:val="28"/>
+          <w:highlight w:val="yellow"/>
           <w:lang w:val="en-US"/>
         </w:rPr>
       </w:r>
@@ -16367,7 +16377,7 @@
         <w:ind w:firstLine="0"/>
         <w:rPr>
           <w:szCs w:val="28"/>
-          <w:lang w:val="en-US"/>
+          <w:highlight w:val="yellow"/>
         </w:rPr>
       </w:pPr>
       <w:r>
@@ -16376,17 +16386,26 @@
           <w:lang w:val="en-US"/>
         </w:rPr>
         <w:tab/>
+      </w:r>
+      <w:r>
+        <w:rPr>
+          <w:szCs w:val="28"/>
+          <w:highlight w:val="yellow"/>
+          <w:lang w:val="en-US"/>
+        </w:rPr>
         <w:t xml:space="preserve">E. A và B đúng</w:t>
       </w:r>
       <w:r>
         <w:rPr>
           <w:szCs w:val="28"/>
-          <w:lang w:val="en-US"/>
-        </w:rPr>
-      </w:r>
-      <w:r>
-        <w:rPr>
-          <w:szCs w:val="28"/>
+          <w:highlight w:val="yellow"/>
+          <w:lang w:val="en-US"/>
+        </w:rPr>
+      </w:r>
+      <w:r>
+        <w:rPr>
+          <w:szCs w:val="28"/>
+          <w:highlight w:val="yellow"/>
           <w:lang w:val="en-US"/>
         </w:rPr>
       </w:r>
@@ -16493,7 +16512,7 @@
         <w:ind w:firstLine="0"/>
         <w:rPr>
           <w:szCs w:val="28"/>
-          <w:lang w:val="en-US"/>
+          <w:highlight w:val="yellow"/>
         </w:rPr>
       </w:pPr>
       <w:r>
@@ -16502,17 +16521,26 @@
           <w:lang w:val="en-US"/>
         </w:rPr>
         <w:tab/>
+      </w:r>
+      <w:r>
+        <w:rPr>
+          <w:szCs w:val="28"/>
+          <w:highlight w:val="yellow"/>
+          <w:lang w:val="en-US"/>
+        </w:rPr>
         <w:t xml:space="preserve">A. (1) NADPH, (2) pentose phosphat</w:t>
       </w:r>
       <w:r>
         <w:rPr>
           <w:szCs w:val="28"/>
-          <w:lang w:val="en-US"/>
-        </w:rPr>
-      </w:r>
-      <w:r>
-        <w:rPr>
-          <w:szCs w:val="28"/>
+          <w:highlight w:val="yellow"/>
+          <w:lang w:val="en-US"/>
+        </w:rPr>
+      </w:r>
+      <w:r>
+        <w:rPr>
+          <w:szCs w:val="28"/>
+          <w:highlight w:val="yellow"/>
           <w:lang w:val="en-US"/>
         </w:rPr>
       </w:r>
@@ -16931,7 +16959,7 @@
         <w:ind w:firstLine="0"/>
         <w:rPr>
           <w:szCs w:val="28"/>
-          <w:lang w:val="en-US"/>
+          <w:highlight w:val="yellow"/>
         </w:rPr>
       </w:pPr>
       <w:r>
@@ -16940,17 +16968,26 @@
           <w:lang w:val="en-US"/>
         </w:rPr>
         <w:tab/>
+      </w:r>
+      <w:r>
+        <w:rPr>
+          <w:szCs w:val="28"/>
+          <w:highlight w:val="yellow"/>
+          <w:lang w:val="en-US"/>
+        </w:rPr>
         <w:t xml:space="preserve">E. A và B đúng</w:t>
       </w:r>
       <w:r>
         <w:rPr>
           <w:szCs w:val="28"/>
-          <w:lang w:val="en-US"/>
-        </w:rPr>
-      </w:r>
-      <w:r>
-        <w:rPr>
-          <w:szCs w:val="28"/>
+          <w:highlight w:val="yellow"/>
+          <w:lang w:val="en-US"/>
+        </w:rPr>
+      </w:r>
+      <w:r>
+        <w:rPr>
+          <w:szCs w:val="28"/>
+          <w:highlight w:val="yellow"/>
           <w:lang w:val="en-US"/>
         </w:rPr>
       </w:r>
@@ -17162,6 +17199,7 @@
         <w:ind w:firstLine="0"/>
         <w:rPr>
           <w:szCs w:val="28"/>
+          <w:highlight w:val="yellow"/>
         </w:rPr>
       </w:pPr>
       <w:r>
@@ -17170,16 +17208,25 @@
           <w:lang w:val="en-US"/>
         </w:rPr>
         <w:tab/>
+      </w:r>
+      <w:r>
+        <w:rPr>
+          <w:szCs w:val="28"/>
+          <w:highlight w:val="yellow"/>
+          <w:lang w:val="en-US"/>
+        </w:rPr>
         <w:t xml:space="preserve">E. (1) Bào tương, (2) Glucose-6P</w:t>
       </w:r>
       <w:r>
         <w:rPr>
           <w:szCs w:val="28"/>
-        </w:rPr>
-      </w:r>
-      <w:r>
-        <w:rPr>
-          <w:szCs w:val="28"/>
+          <w:highlight w:val="yellow"/>
+        </w:rPr>
+      </w:r>
+      <w:r>
+        <w:rPr>
+          <w:szCs w:val="28"/>
+          <w:highlight w:val="yellow"/>
         </w:rPr>
       </w:r>
     </w:p>
@@ -18092,30 +18139,38 @@
         <w:ind/>
         <w:rPr>
           <w:rFonts w:cs="Times New Roman"/>
-          <w:szCs w:val="28"/>
-          <w:highlight w:val="none"/>
-        </w:rPr>
-      </w:pPr>
-      <w:r>
-        <w:rPr>
-          <w:rFonts w:cs="Times New Roman"/>
-          <w:szCs w:val="28"/>
-          <w:highlight w:val="none"/>
+          <w:b/>
+          <w:bCs/>
+          <w:szCs w:val="28"/>
+          <w:highlight w:val="yellow"/>
+        </w:rPr>
+      </w:pPr>
+      <w:r>
+        <w:rPr>
+          <w:rFonts w:cs="Times New Roman"/>
+          <w:b/>
+          <w:bCs/>
+          <w:szCs w:val="28"/>
+          <w:highlight w:val="yellow"/>
         </w:rPr>
         <w:t xml:space="preserve">B. Acetyl CoA đi vào chu trình Krebs tạo 38 ATP</w:t>
       </w:r>
       <w:r>
         <w:rPr>
           <w:rFonts w:cs="Times New Roman"/>
-          <w:szCs w:val="28"/>
-          <w:highlight w:val="none"/>
-        </w:rPr>
-      </w:r>
-      <w:r>
-        <w:rPr>
-          <w:rFonts w:cs="Times New Roman"/>
-          <w:szCs w:val="28"/>
-          <w:highlight w:val="none"/>
+          <w:b/>
+          <w:bCs/>
+          <w:szCs w:val="28"/>
+          <w:highlight w:val="yellow"/>
+        </w:rPr>
+      </w:r>
+      <w:r>
+        <w:rPr>
+          <w:rFonts w:cs="Times New Roman"/>
+          <w:b/>
+          <w:bCs/>
+          <w:szCs w:val="28"/>
+          <w:highlight w:val="yellow"/>
         </w:rPr>
       </w:r>
     </w:p>
@@ -18136,14 +18191,14 @@
         <w:rPr>
           <w:rFonts w:cs="Times New Roman"/>
           <w:szCs w:val="28"/>
-          <w:highlight w:val="yellow"/>
-        </w:rPr>
-      </w:pPr>
-      <w:r>
-        <w:rPr>
-          <w:rFonts w:cs="Times New Roman"/>
-          <w:szCs w:val="28"/>
-          <w:highlight w:val="yellow"/>
+          <w:highlight w:val="none"/>
+        </w:rPr>
+      </w:pPr>
+      <w:r>
+        <w:rPr>
+          <w:rFonts w:cs="Times New Roman"/>
+          <w:szCs w:val="28"/>
+          <w:highlight w:val="none"/>
         </w:rPr>
         <w:t xml:space="preserve">C. CO</w:t>
       </w:r>
@@ -18151,7 +18206,7 @@
         <w:rPr>
           <w:rFonts w:cs="Times New Roman"/>
           <w:szCs w:val="28"/>
-          <w:highlight w:val="yellow"/>
+          <w:highlight w:val="none"/>
           <w:vertAlign w:val="subscript"/>
         </w:rPr>
         <w:t xml:space="preserve">2</w:t>
@@ -18160,7 +18215,7 @@
         <w:rPr>
           <w:rFonts w:cs="Times New Roman"/>
           <w:szCs w:val="28"/>
-          <w:highlight w:val="yellow"/>
+          <w:highlight w:val="none"/>
         </w:rPr>
         <w:t xml:space="preserve"> và H</w:t>
       </w:r>
@@ -18168,7 +18223,7 @@
         <w:rPr>
           <w:rFonts w:cs="Times New Roman"/>
           <w:szCs w:val="28"/>
-          <w:highlight w:val="yellow"/>
+          <w:highlight w:val="none"/>
           <w:vertAlign w:val="subscript"/>
         </w:rPr>
         <w:t xml:space="preserve">2</w:t>
@@ -18177,7 +18232,7 @@
         <w:rPr>
           <w:rFonts w:cs="Times New Roman"/>
           <w:szCs w:val="28"/>
-          <w:highlight w:val="yellow"/>
+          <w:highlight w:val="none"/>
         </w:rPr>
         <w:t xml:space="preserve">O</w:t>
       </w:r>
@@ -18185,14 +18240,14 @@
         <w:rPr>
           <w:rFonts w:cs="Times New Roman"/>
           <w:szCs w:val="28"/>
-          <w:highlight w:val="yellow"/>
-        </w:rPr>
-      </w:r>
-      <w:r>
-        <w:rPr>
-          <w:rFonts w:cs="Times New Roman"/>
-          <w:szCs w:val="28"/>
-          <w:highlight w:val="yellow"/>
+          <w:highlight w:val="none"/>
+        </w:rPr>
+      </w:r>
+      <w:r>
+        <w:rPr>
+          <w:rFonts w:cs="Times New Roman"/>
+          <w:szCs w:val="28"/>
+          <w:highlight w:val="none"/>
         </w:rPr>
       </w:r>
     </w:p>
@@ -19105,6 +19160,7 @@
           <w:bCs/>
           <w:iCs/>
           <w:szCs w:val="28"/>
+          <w:highlight w:val="yellow"/>
         </w:rPr>
       </w:pPr>
       <w:r>
@@ -19113,6 +19169,7 @@
           <w:bCs/>
           <w:iCs/>
           <w:szCs w:val="28"/>
+          <w:highlight w:val="yellow"/>
         </w:rPr>
         <w:t xml:space="preserve">D. Cả A, B và C đều đúng</w:t>
       </w:r>
@@ -19122,6 +19179,7 @@
           <w:bCs/>
           <w:iCs/>
           <w:szCs w:val="28"/>
+          <w:highlight w:val="yellow"/>
         </w:rPr>
       </w:r>
       <w:r>
@@ -19130,6 +19188,7 @@
           <w:bCs/>
           <w:iCs/>
           <w:szCs w:val="28"/>
+          <w:highlight w:val="yellow"/>
         </w:rPr>
       </w:r>
     </w:p>
@@ -19238,6 +19297,7 @@
           <w:bCs/>
           <w:iCs/>
           <w:szCs w:val="28"/>
+          <w:highlight w:val="yellow"/>
         </w:rPr>
         <w:t xml:space="preserve">A. CH</w:t>
       </w:r>
@@ -19247,6 +19307,7 @@
           <w:bCs/>
           <w:iCs/>
           <w:szCs w:val="28"/>
+          <w:highlight w:val="yellow"/>
           <w:vertAlign w:val="subscript"/>
         </w:rPr>
         <w:t xml:space="preserve">3</w:t>
@@ -19257,6 +19318,7 @@
           <w:bCs/>
           <w:iCs/>
           <w:szCs w:val="28"/>
+          <w:highlight w:val="yellow"/>
         </w:rPr>
         <w:t xml:space="preserve">-CO-COOH</w:t>
       </w:r>
@@ -19479,6 +19541,7 @@
           <w:bCs/>
           <w:iCs/>
           <w:szCs w:val="28"/>
+          <w:highlight w:val="yellow"/>
         </w:rPr>
       </w:pPr>
       <w:r>
@@ -19487,6 +19550,7 @@
           <w:bCs/>
           <w:iCs/>
           <w:szCs w:val="28"/>
+          <w:highlight w:val="yellow"/>
         </w:rPr>
         <w:t xml:space="preserve">A. Xảy ra ở bào tương, qua 2 giai đoạn gồm 10 phản ứng. Giai đoạn hoạt hóa  5 phản ứng. Giai đoạn oxy hóa sinh năng lượng 5 phản ứng.</w:t>
       </w:r>
@@ -19496,6 +19560,7 @@
           <w:bCs/>
           <w:iCs/>
           <w:szCs w:val="28"/>
+          <w:highlight w:val="yellow"/>
         </w:rPr>
       </w:r>
       <w:r>
@@ -19504,6 +19569,7 @@
           <w:bCs/>
           <w:iCs/>
           <w:szCs w:val="28"/>
+          <w:highlight w:val="yellow"/>
         </w:rPr>
       </w:r>
     </w:p>
@@ -19745,6 +19811,7 @@
           <w:bCs/>
           <w:iCs/>
           <w:szCs w:val="28"/>
+          <w:highlight w:val="yellow"/>
         </w:rPr>
       </w:pPr>
       <w:r>
@@ -19753,6 +19820,7 @@
           <w:bCs/>
           <w:iCs/>
           <w:szCs w:val="28"/>
+          <w:highlight w:val="yellow"/>
         </w:rPr>
         <w:t xml:space="preserve">A. Là hormon làm giảm đường huyết bằng cách tăng nhập Glucose vào tế bào và tăng sử dụng Glucose ở gan đồng thới ức chế các Enzym tân tạo đường.</w:t>
       </w:r>
@@ -19762,6 +19830,7 @@
           <w:bCs/>
           <w:iCs/>
           <w:szCs w:val="28"/>
+          <w:highlight w:val="yellow"/>
         </w:rPr>
       </w:r>
       <w:r>
@@ -19770,6 +19839,7 @@
           <w:bCs/>
           <w:iCs/>
           <w:szCs w:val="28"/>
+          <w:highlight w:val="yellow"/>
         </w:rPr>
       </w:r>
     </w:p>
@@ -20030,6 +20100,7 @@
       <w:r>
         <w:rPr>
           <w:szCs w:val="28"/>
+          <w:highlight w:val="yellow"/>
           <w:lang w:val="en-US"/>
         </w:rPr>
         <w:t xml:space="preserve">A.(</w:t>
@@ -20037,6 +20108,7 @@
       <w:r>
         <w:rPr>
           <w:szCs w:val="28"/>
+          <w:highlight w:val="yellow"/>
           <w:lang w:val="en-US"/>
         </w:rPr>
         <w:t xml:space="preserve">1) Cori, (2) yếm khí, (3) cơ</w:t>
@@ -20253,7 +20325,7 @@
           <w:szCs w:val="28"/>
           <w:lang w:val="en-US"/>
         </w:rPr>
-        <w:t xml:space="preserve">Câu 91:</w:t>
+        <w:t xml:space="preserve">*Câu 91:</w:t>
       </w:r>
       <w:r>
         <w:rPr>
@@ -20328,6 +20400,13 @@
           <w:lang w:val="en-US"/>
         </w:rPr>
         <w:tab/>
+      </w:r>
+      <w:r>
+        <w:rPr>
+          <w:szCs w:val="28"/>
+          <w:highlight w:val="yellow"/>
+          <w:lang w:val="en-US"/>
+        </w:rPr>
         <w:t xml:space="preserve">D. A và B</w:t>
       </w:r>
       <w:r>
@@ -20423,6 +20502,7 @@
       <w:r>
         <w:rPr>
           <w:szCs w:val="28"/>
+          <w:highlight w:val="yellow"/>
           <w:lang w:val="en-US"/>
         </w:rPr>
         <w:t xml:space="preserve">A.Ty</w:t>
@@ -20430,6 +20510,7 @@
       <w:r>
         <w:rPr>
           <w:szCs w:val="28"/>
+          <w:highlight w:val="yellow"/>
           <w:lang w:val="en-US"/>
         </w:rPr>
         <w:t xml:space="preserve"> thể</w:t>
@@ -20540,7 +20621,7 @@
         <w:ind w:firstLine="0"/>
         <w:rPr>
           <w:szCs w:val="28"/>
-          <w:lang w:val="en-US"/>
+          <w:highlight w:val="yellow"/>
         </w:rPr>
       </w:pPr>
       <w:r>
@@ -20549,17 +20630,26 @@
           <w:lang w:val="en-US"/>
         </w:rPr>
         <w:tab/>
+      </w:r>
+      <w:r>
+        <w:rPr>
+          <w:szCs w:val="28"/>
+          <w:highlight w:val="yellow"/>
+          <w:lang w:val="en-US"/>
+        </w:rPr>
         <w:t xml:space="preserve">A. Chu trình Cori là quá trình chuyển hóa hiếu khí Glucose tại cơ tạo acid Lactic, giải phóng 2 ATP</w:t>
       </w:r>
       <w:r>
         <w:rPr>
           <w:szCs w:val="28"/>
-          <w:lang w:val="en-US"/>
-        </w:rPr>
-      </w:r>
-      <w:r>
-        <w:rPr>
-          <w:szCs w:val="28"/>
+          <w:highlight w:val="yellow"/>
+          <w:lang w:val="en-US"/>
+        </w:rPr>
+      </w:r>
+      <w:r>
+        <w:rPr>
+          <w:szCs w:val="28"/>
+          <w:highlight w:val="yellow"/>
           <w:lang w:val="en-US"/>
         </w:rPr>
       </w:r>
@@ -20829,6 +20919,13 @@
           <w:lang w:val="en-US"/>
         </w:rPr>
         <w:tab/>
+      </w:r>
+      <w:r>
+        <w:rPr>
+          <w:szCs w:val="28"/>
+          <w:highlight w:val="yellow"/>
+          <w:lang w:val="en-US"/>
+        </w:rPr>
         <w:t xml:space="preserve">B. Acid Lactic được máu vận chuyển về gan để tổng hợp Glucose, tổng hợp 6 ATP</w:t>
       </w:r>
       <w:r>
@@ -21109,10 +21206,21 @@
           <w:lang w:val="en-US"/>
         </w:rPr>
         <w:tab/>
+      </w:r>
+      <w:r>
+        <w:rPr>
+          <w:b/>
+          <w:bCs/>
+          <w:szCs w:val="28"/>
+          <w:highlight w:val="yellow"/>
+          <w:lang w:val="en-US"/>
+        </w:rPr>
         <w:t xml:space="preserve">C. Đường phân Glucose tại cơ tạo Pyruvat, Pyruvat chuyển hóa hiếu khi tạo Acid Lactic</w:t>
       </w:r>
       <w:r>
         <w:rPr>
+          <w:b/>
+          <w:bCs/>
           <w:szCs w:val="28"/>
           <w:lang w:val="en-US"/>
         </w:rPr>
@@ -21139,7 +21247,7 @@
         <w:ind w:firstLine="0"/>
         <w:rPr>
           <w:szCs w:val="28"/>
-          <w:lang w:val="en-US"/>
+          <w:highlight w:val="yellow"/>
         </w:rPr>
       </w:pPr>
       <w:r>
@@ -21148,17 +21256,26 @@
           <w:lang w:val="en-US"/>
         </w:rPr>
         <w:tab/>
+      </w:r>
+      <w:r>
+        <w:rPr>
+          <w:szCs w:val="28"/>
+          <w:highlight w:val="none"/>
+          <w:lang w:val="en-US"/>
+        </w:rPr>
         <w:t xml:space="preserve">D. Acid lactic về gan chuyển thành Pyruvat nhờ enzym Lactat dehydrocgenase</w:t>
       </w:r>
       <w:r>
         <w:rPr>
           <w:szCs w:val="28"/>
-          <w:lang w:val="en-US"/>
-        </w:rPr>
-      </w:r>
-      <w:r>
-        <w:rPr>
-          <w:szCs w:val="28"/>
+          <w:highlight w:val="none"/>
+          <w:lang w:val="en-US"/>
+        </w:rPr>
+      </w:r>
+      <w:r>
+        <w:rPr>
+          <w:szCs w:val="28"/>
+          <w:highlight w:val="yellow"/>
           <w:lang w:val="en-US"/>
         </w:rPr>
       </w:r>
@@ -21379,27 +21496,45 @@
         <w:spacing/>
         <w:ind w:firstLine="0"/>
         <w:rPr>
-          <w:szCs w:val="28"/>
-          <w:lang w:val="en-US"/>
-        </w:rPr>
-      </w:pPr>
-      <w:r>
-        <w:rPr>
-          <w:szCs w:val="28"/>
+          <w:b/>
+          <w:bCs/>
+          <w:szCs w:val="28"/>
+          <w:highlight w:val="yellow"/>
+        </w:rPr>
+      </w:pPr>
+      <w:r>
+        <w:rPr>
+          <w:szCs w:val="28"/>
+          <w:highlight w:val="yellow"/>
           <w:lang w:val="en-US"/>
         </w:rPr>
         <w:tab/>
+      </w:r>
+      <w:r>
+        <w:rPr>
+          <w:b/>
+          <w:bCs/>
+          <w:szCs w:val="28"/>
+          <w:highlight w:val="yellow"/>
+          <w:lang w:val="en-US"/>
+        </w:rPr>
         <w:t xml:space="preserve">D. Acid lactic về gan chuyển thành Pyruvat nhờ enzym Pyruvat dehydrocgenase</w:t>
       </w:r>
       <w:r>
         <w:rPr>
-          <w:szCs w:val="28"/>
-          <w:lang w:val="en-US"/>
-        </w:rPr>
-      </w:r>
-      <w:r>
-        <w:rPr>
-          <w:szCs w:val="28"/>
+          <w:b/>
+          <w:bCs/>
+          <w:szCs w:val="28"/>
+          <w:highlight w:val="yellow"/>
+          <w:lang w:val="en-US"/>
+        </w:rPr>
+      </w:r>
+      <w:r>
+        <w:rPr>
+          <w:b/>
+          <w:bCs/>
+          <w:szCs w:val="28"/>
+          <w:highlight w:val="yellow"/>
           <w:lang w:val="en-US"/>
         </w:rPr>
       </w:r>
@@ -21419,7 +21554,7 @@
         <w:ind w:firstLine="0"/>
         <w:rPr>
           <w:szCs w:val="28"/>
-          <w:lang w:val="en-US"/>
+          <w:highlight w:val="none"/>
         </w:rPr>
       </w:pPr>
       <w:r>
@@ -21428,17 +21563,26 @@
           <w:lang w:val="en-US"/>
         </w:rPr>
         <w:tab/>
+      </w:r>
+      <w:r>
+        <w:rPr>
+          <w:szCs w:val="28"/>
+          <w:highlight w:val="none"/>
+          <w:lang w:val="en-US"/>
+        </w:rPr>
         <w:t xml:space="preserve">E. Hiện tượng hoạt động mạnh trong thời gian ngắn gây đau cơ là do chuyển hóa yếm khí Pyruvat theo chu trình Cori tạo acid lactic </w:t>
       </w:r>
       <w:r>
         <w:rPr>
           <w:szCs w:val="28"/>
-          <w:lang w:val="en-US"/>
-        </w:rPr>
-      </w:r>
-      <w:r>
-        <w:rPr>
-          <w:szCs w:val="28"/>
+          <w:highlight w:val="none"/>
+          <w:lang w:val="en-US"/>
+        </w:rPr>
+      </w:r>
+      <w:r>
+        <w:rPr>
+          <w:szCs w:val="28"/>
+          <w:highlight w:val="none"/>
           <w:lang w:val="en-US"/>
         </w:rPr>
       </w:r>
@@ -21660,7 +21804,7 @@
         <w:ind w:firstLine="0"/>
         <w:rPr>
           <w:szCs w:val="28"/>
-          <w:lang w:val="en-US"/>
+          <w:highlight w:val="yellow"/>
         </w:rPr>
       </w:pPr>
       <w:r>
@@ -21669,17 +21813,26 @@
           <w:lang w:val="en-US"/>
         </w:rPr>
         <w:tab/>
+      </w:r>
+      <w:r>
+        <w:rPr>
+          <w:szCs w:val="28"/>
+          <w:highlight w:val="yellow"/>
+          <w:lang w:val="en-US"/>
+        </w:rPr>
         <w:t xml:space="preserve">E. Hiện tượng hoạt động mạnh trong thời gian ngắn gây đau cơ là do chuyển hóa hiếu khí Pyruvat theo chu trình Cori tạo acid lactic </w:t>
       </w:r>
       <w:r>
         <w:rPr>
           <w:szCs w:val="28"/>
-          <w:lang w:val="en-US"/>
-        </w:rPr>
-      </w:r>
-      <w:r>
-        <w:rPr>
-          <w:szCs w:val="28"/>
+          <w:highlight w:val="yellow"/>
+          <w:lang w:val="en-US"/>
+        </w:rPr>
+      </w:r>
+      <w:r>
+        <w:rPr>
+          <w:szCs w:val="28"/>
+          <w:highlight w:val="yellow"/>
           <w:lang w:val="en-US"/>
         </w:rPr>
       </w:r>
@@ -21904,7 +22057,7 @@
         <w:ind w:firstLine="0"/>
         <w:rPr>
           <w:szCs w:val="28"/>
-          <w:lang w:val="en-US"/>
+          <w:highlight w:val="yellow"/>
         </w:rPr>
       </w:pPr>
       <w:r>
@@ -21918,6 +22071,7 @@
       <w:r>
         <w:rPr>
           <w:szCs w:val="28"/>
+          <w:highlight w:val="yellow"/>
           <w:lang w:val="en-US"/>
         </w:rPr>
         <w:t xml:space="preserve">E. Hiện tượng hoạt động mạnh trong thời gian ngắn gây đau cơ là do chuyển hóa yếm khí Pyruvat theo chu trình Glucose-Alanin tạo acid lactic </w:t>
@@ -21925,12 +22079,14 @@
       <w:r>
         <w:rPr>
           <w:szCs w:val="28"/>
-          <w:lang w:val="en-US"/>
-        </w:rPr>
-      </w:r>
-      <w:r>
-        <w:rPr>
-          <w:szCs w:val="28"/>
+          <w:highlight w:val="yellow"/>
+          <w:lang w:val="en-US"/>
+        </w:rPr>
+      </w:r>
+      <w:r>
+        <w:rPr>
+          <w:szCs w:val="28"/>
+          <w:highlight w:val="yellow"/>
           <w:lang w:val="en-US"/>
         </w:rPr>
       </w:r>
@@ -22155,7 +22311,7 @@
         <w:ind w:firstLine="0"/>
         <w:rPr>
           <w:szCs w:val="28"/>
-          <w:lang w:val="en-US"/>
+          <w:highlight w:val="yellow"/>
         </w:rPr>
       </w:pPr>
       <w:r>
@@ -22169,6 +22325,7 @@
       <w:r>
         <w:rPr>
           <w:szCs w:val="28"/>
+          <w:highlight w:val="yellow"/>
           <w:lang w:val="en-US"/>
         </w:rPr>
         <w:t xml:space="preserve">E. Tất cả đều sai</w:t>
@@ -22176,12 +22333,14 @@
       <w:r>
         <w:rPr>
           <w:szCs w:val="28"/>
-          <w:lang w:val="en-US"/>
-        </w:rPr>
-      </w:r>
-      <w:r>
-        <w:rPr>
-          <w:szCs w:val="28"/>
+          <w:highlight w:val="yellow"/>
+          <w:lang w:val="en-US"/>
+        </w:rPr>
+      </w:r>
+      <w:r>
+        <w:rPr>
+          <w:szCs w:val="28"/>
+          <w:highlight w:val="yellow"/>
           <w:lang w:val="en-US"/>
         </w:rPr>
       </w:r>
@@ -22365,7 +22524,7 @@
         <w:rPr>
           <w:b/>
           <w:szCs w:val="28"/>
-          <w:lang w:val="en-US"/>
+          <w:highlight w:val="yellow"/>
         </w:rPr>
       </w:pPr>
       <w:r>
@@ -22374,12 +22533,20 @@
           <w:lang w:val="en-US"/>
         </w:rPr>
         <w:tab/>
+      </w:r>
+      <w:r>
+        <w:rPr>
+          <w:szCs w:val="28"/>
+          <w:highlight w:val="yellow"/>
+          <w:lang w:val="en-US"/>
+        </w:rPr>
         <w:t xml:space="preserve">D. Tất cả đều đúng</w:t>
       </w:r>
       <w:r>
         <w:rPr>
           <w:b/>
           <w:szCs w:val="28"/>
+          <w:highlight w:val="yellow"/>
           <w:lang w:val="en-US"/>
         </w:rPr>
       </w:r>
@@ -22387,6 +22554,7 @@
         <w:rPr>
           <w:b/>
           <w:szCs w:val="28"/>
+          <w:highlight w:val="yellow"/>
           <w:lang w:val="en-US"/>
         </w:rPr>
       </w:r>
@@ -22934,6 +23102,13 @@
           <w:lang w:val="en-US"/>
         </w:rPr>
         <w:tab/>
+      </w:r>
+      <w:r>
+        <w:rPr>
+          <w:szCs w:val="28"/>
+          <w:highlight w:val="yellow"/>
+          <w:lang w:val="en-US"/>
+        </w:rPr>
         <w:t xml:space="preserve">D. (I) Glucose-1P, (II) UDP-Glucose</w:t>
       </w:r>
       <w:r>
@@ -23447,11 +23622,19 @@
           <w:lang w:val="en-US"/>
         </w:rPr>
         <w:tab/>
+      </w:r>
+      <w:r>
+        <w:rPr>
+          <w:szCs w:val="28"/>
+          <w:highlight w:val="yellow"/>
+          <w:lang w:val="en-US"/>
+        </w:rPr>
         <w:t xml:space="preserve">C. (I) Glucose-6P, (II) Glucose-1P</w:t>
       </w:r>
       <w:r>
         <w:rPr>
           <w:szCs w:val="28"/>
+          <w:highlight w:val="yellow"/>
           <w:lang w:val="en-US"/>
         </w:rPr>
       </w:r>
@@ -23632,6 +23815,7 @@
         <w:rPr>
           <w:rFonts w:cs="Times New Roman"/>
           <w:szCs w:val="28"/>
+          <w:highlight w:val="none"/>
         </w:rPr>
         <w:t xml:space="preserve">A. 50-60%</w:t>
       </w:r>
@@ -23639,8 +23823,18 @@
         <w:rPr>
           <w:rFonts w:cs="Times New Roman"/>
           <w:szCs w:val="28"/>
+          <w:highlight w:val="none"/>
         </w:rPr>
         <w:tab/>
+      </w:r>
+      <w:r>
+        <w:rPr>
+          <w:rFonts w:cs="Times New Roman"/>
+          <w:b/>
+          <w:bCs/>
+          <w:szCs w:val="28"/>
+          <w:highlight w:val="yellow"/>
+        </w:rPr>
         <w:t xml:space="preserve">B. 80-90%</w:t>
       </w:r>
       <w:r>
@@ -23782,6 +23976,7 @@
         <w:rPr>
           <w:rFonts w:cs="Times New Roman"/>
           <w:szCs w:val="28"/>
+          <w:highlight w:val="yellow"/>
         </w:rPr>
         <w:t xml:space="preserve">A. pH 6,8 – 7</w:t>
       </w:r>
@@ -24077,6 +24272,7 @@
           <w:bCs/>
           <w:iCs/>
           <w:szCs w:val="28"/>
+          <w:highlight w:val="yellow"/>
         </w:rPr>
       </w:pPr>
       <w:r>
@@ -24085,6 +24281,7 @@
           <w:bCs/>
           <w:iCs/>
           <w:szCs w:val="28"/>
+          <w:highlight w:val="yellow"/>
         </w:rPr>
         <w:t xml:space="preserve">D. Cả A và C đúng</w:t>
       </w:r>
@@ -24094,6 +24291,7 @@
           <w:bCs/>
           <w:iCs/>
           <w:szCs w:val="28"/>
+          <w:highlight w:val="yellow"/>
         </w:rPr>
       </w:r>
       <w:r>
@@ -24102,6 +24300,7 @@
           <w:bCs/>
           <w:iCs/>
           <w:szCs w:val="28"/>
+          <w:highlight w:val="yellow"/>
         </w:rPr>
       </w:r>
     </w:p>
@@ -24305,6 +24504,7 @@
           <w:bCs/>
           <w:iCs/>
           <w:szCs w:val="28"/>
+          <w:highlight w:val="yellow"/>
         </w:rPr>
         <w:t xml:space="preserve">C. CH</w:t>
       </w:r>
@@ -24314,6 +24514,7 @@
           <w:bCs/>
           <w:iCs/>
           <w:szCs w:val="28"/>
+          <w:highlight w:val="yellow"/>
           <w:vertAlign w:val="subscript"/>
         </w:rPr>
         <w:t xml:space="preserve">3</w:t>
@@ -24324,6 +24525,7 @@
           <w:bCs/>
           <w:iCs/>
           <w:szCs w:val="28"/>
+          <w:highlight w:val="yellow"/>
         </w:rPr>
         <w:t xml:space="preserve">–CO~SCoA</w:t>
       </w:r>
@@ -24498,6 +24700,7 @@
           <w:bCs/>
           <w:iCs/>
           <w:szCs w:val="28"/>
+          <w:highlight w:val="yellow"/>
         </w:rPr>
       </w:pPr>
       <w:r>
@@ -24506,6 +24709,7 @@
           <w:bCs/>
           <w:iCs/>
           <w:szCs w:val="28"/>
+          <w:highlight w:val="yellow"/>
         </w:rPr>
         <w:t xml:space="preserve">B. Quan trọng ở các tế bào phân chia nhanh và các tế bào cần NADPH</w:t>
       </w:r>
@@ -24515,6 +24719,7 @@
           <w:bCs/>
           <w:iCs/>
           <w:szCs w:val="28"/>
+          <w:highlight w:val="yellow"/>
           <w:vertAlign w:val="subscript"/>
         </w:rPr>
         <w:t xml:space="preserve">2 </w:t>
@@ -24525,6 +24730,7 @@
           <w:bCs/>
           <w:iCs/>
           <w:szCs w:val="28"/>
+          <w:highlight w:val="yellow"/>
         </w:rPr>
         <w:t xml:space="preserve"> để chống lại tác nhân oxy hóa và sinh tổng hợp acid béo, cholesterol.</w:t>
       </w:r>
@@ -24534,6 +24740,7 @@
           <w:bCs/>
           <w:iCs/>
           <w:szCs w:val="28"/>
+          <w:highlight w:val="yellow"/>
         </w:rPr>
       </w:r>
       <w:r>
@@ -24542,6 +24749,7 @@
           <w:bCs/>
           <w:iCs/>
           <w:szCs w:val="28"/>
+          <w:highlight w:val="yellow"/>
         </w:rPr>
       </w:r>
     </w:p>
@@ -24688,7 +24896,23 @@
           <w:rFonts w:cs="Times New Roman"/>
           <w:szCs w:val="28"/>
         </w:rPr>
-        <w:t xml:space="preserve"> Nguyên liệu tổng hợp Glycogen ở cơ là gì?</w:t>
+        <w:t xml:space="preserve"> Nguyên liệu tổng hợp Glycogen ở </w:t>
+      </w:r>
+      <w:r>
+        <w:rPr>
+          <w:rFonts w:cs="Times New Roman"/>
+          <w:b/>
+          <w:bCs/>
+          <w:szCs w:val="28"/>
+        </w:rPr>
+        <w:t xml:space="preserve">cơ </w:t>
+      </w:r>
+      <w:r>
+        <w:rPr>
+          <w:rFonts w:cs="Times New Roman"/>
+          <w:szCs w:val="28"/>
+        </w:rPr>
+        <w:t xml:space="preserve">là gì?</w:t>
       </w:r>
       <w:r>
         <w:rPr>
@@ -24719,7 +24943,10 @@
         <w:ind w:firstLine="0"/>
         <w:rPr>
           <w:rFonts w:cs="Times New Roman"/>
-          <w:szCs w:val="28"/>
+          <w:b/>
+          <w:bCs/>
+          <w:szCs w:val="28"/>
+          <w:highlight w:val="yellow"/>
         </w:rPr>
       </w:pPr>
       <w:r>
@@ -24734,6 +24961,7 @@
         <w:rPr>
           <w:rFonts w:cs="Times New Roman"/>
           <w:szCs w:val="28"/>
+          <w:highlight w:val="none"/>
         </w:rPr>
         <w:t xml:space="preserve">A. Glucose và các MS khác</w:t>
       </w:r>
@@ -24743,18 +24971,33 @@
           <w:szCs w:val="28"/>
         </w:rPr>
         <w:tab/>
+      </w:r>
+      <w:r>
+        <w:rPr>
+          <w:rFonts w:cs="Times New Roman"/>
+          <w:b/>
+          <w:bCs/>
+          <w:szCs w:val="28"/>
+          <w:highlight w:val="yellow"/>
+        </w:rPr>
         <w:t xml:space="preserve">B. Chỉ từ Glucose</w:t>
       </w:r>
       <w:r>
         <w:rPr>
           <w:rFonts w:cs="Times New Roman"/>
-          <w:szCs w:val="28"/>
-        </w:rPr>
-      </w:r>
-      <w:r>
-        <w:rPr>
-          <w:rFonts w:cs="Times New Roman"/>
-          <w:szCs w:val="28"/>
+          <w:b/>
+          <w:bCs/>
+          <w:szCs w:val="28"/>
+          <w:highlight w:val="yellow"/>
+        </w:rPr>
+      </w:r>
+      <w:r>
+        <w:rPr>
+          <w:rFonts w:cs="Times New Roman"/>
+          <w:b/>
+          <w:bCs/>
+          <w:szCs w:val="28"/>
+          <w:highlight w:val="yellow"/>
         </w:rPr>
       </w:r>
     </w:p>
@@ -24903,6 +25146,7 @@
           <w:bCs/>
           <w:iCs/>
           <w:szCs w:val="28"/>
+          <w:highlight w:val="yellow"/>
         </w:rPr>
       </w:pPr>
       <w:r>
@@ -24942,6 +25186,15 @@
           <w:szCs w:val="28"/>
         </w:rPr>
         <w:tab/>
+      </w:r>
+      <w:r>
+        <w:rPr>
+          <w:rFonts w:cs="Times New Roman"/>
+          <w:bCs/>
+          <w:iCs/>
+          <w:szCs w:val="28"/>
+          <w:highlight w:val="yellow"/>
+        </w:rPr>
         <w:t xml:space="preserve">D. A, B và C đều đúng</w:t>
       </w:r>
       <w:r>
@@ -24950,6 +25203,7 @@
           <w:bCs/>
           <w:iCs/>
           <w:szCs w:val="28"/>
+          <w:highlight w:val="yellow"/>
         </w:rPr>
       </w:r>
       <w:r>
@@ -24958,6 +25212,7 @@
           <w:bCs/>
           <w:iCs/>
           <w:szCs w:val="28"/>
+          <w:highlight w:val="yellow"/>
         </w:rPr>
       </w:r>
     </w:p>
@@ -25057,6 +25312,7 @@
       <w:r>
         <w:rPr>
           <w:szCs w:val="28"/>
+          <w:highlight w:val="yellow"/>
           <w:lang w:val="en-US"/>
         </w:rPr>
         <w:t xml:space="preserve">A.</w:t>
@@ -25064,12 +25320,14 @@
       <w:r>
         <w:rPr>
           <w:szCs w:val="28"/>
+          <w:highlight w:val="yellow"/>
         </w:rPr>
         <w:t xml:space="preserve">Ty</w:t>
       </w:r>
       <w:r>
         <w:rPr>
           <w:szCs w:val="28"/>
+          <w:highlight w:val="yellow"/>
         </w:rPr>
         <w:t xml:space="preserve"> thể</w:t>
       </w:r>
@@ -25300,6 +25558,7 @@
       <w:r>
         <w:rPr>
           <w:szCs w:val="28"/>
+          <w:highlight w:val="yellow"/>
           <w:lang w:val="en-US"/>
         </w:rPr>
         <w:t xml:space="preserve">C.Amylase</w:t>

</xml_diff>

<commit_message>
vault backup: 2026-08-24 08:24:36
</commit_message>
<xml_diff>
--- a/Kỹ thuật Phục hồi chức năng/01. Môn học Cơ sở (II.1)/MH09. Hóa sinh/Đề cương /1. GLUCID.docx
+++ b/Kỹ thuật Phục hồi chức năng/01. Môn học Cơ sở (II.1)/MH09. Hóa sinh/Đề cương /1. GLUCID.docx
@@ -16120,7 +16120,6 @@
         <w:rPr>
           <w:szCs w:val="28"/>
           <w:highlight w:val="yellow"/>
-          <w:lang w:val="en-US"/>
         </w:rPr>
       </w:r>
     </w:p>
@@ -16406,7 +16405,6 @@
         <w:rPr>
           <w:szCs w:val="28"/>
           <w:highlight w:val="yellow"/>
-          <w:lang w:val="en-US"/>
         </w:rPr>
       </w:r>
     </w:p>
@@ -16541,7 +16539,6 @@
         <w:rPr>
           <w:szCs w:val="28"/>
           <w:highlight w:val="yellow"/>
-          <w:lang w:val="en-US"/>
         </w:rPr>
       </w:r>
     </w:p>
@@ -16988,7 +16985,6 @@
         <w:rPr>
           <w:szCs w:val="28"/>
           <w:highlight w:val="yellow"/>
-          <w:lang w:val="en-US"/>
         </w:rPr>
       </w:r>
     </w:p>
@@ -20591,7 +20587,22 @@
           <w:szCs w:val="28"/>
           <w:lang w:val="en-US"/>
         </w:rPr>
-        <w:t xml:space="preserve"> Nhận định nào sau đây là sai về chu trình Cori</w:t>
+        <w:t xml:space="preserve"> Nhận định nào sau đây là </w:t>
+      </w:r>
+      <w:r>
+        <w:rPr>
+          <w:szCs w:val="28"/>
+          <w:u w:val="single"/>
+          <w:lang w:val="en-US"/>
+        </w:rPr>
+        <w:t xml:space="preserve">sai</w:t>
+      </w:r>
+      <w:r>
+        <w:rPr>
+          <w:szCs w:val="28"/>
+          <w:lang w:val="en-US"/>
+        </w:rPr>
+        <w:t xml:space="preserve"> về chu trình Cori</w:t>
       </w:r>
       <w:r>
         <w:rPr>
@@ -20650,7 +20661,6 @@
         <w:rPr>
           <w:szCs w:val="28"/>
           <w:highlight w:val="yellow"/>
-          <w:lang w:val="en-US"/>
         </w:rPr>
       </w:r>
     </w:p>
@@ -21219,8 +21229,6 @@
       </w:r>
       <w:r>
         <w:rPr>
-          <w:b/>
-          <w:bCs/>
           <w:szCs w:val="28"/>
           <w:lang w:val="en-US"/>
         </w:rPr>
@@ -21268,15 +21276,14 @@
       <w:r>
         <w:rPr>
           <w:szCs w:val="28"/>
-          <w:highlight w:val="none"/>
-          <w:lang w:val="en-US"/>
-        </w:rPr>
-      </w:r>
-      <w:r>
-        <w:rPr>
-          <w:szCs w:val="28"/>
           <w:highlight w:val="yellow"/>
           <w:lang w:val="en-US"/>
+        </w:rPr>
+      </w:r>
+      <w:r>
+        <w:rPr>
+          <w:szCs w:val="28"/>
+          <w:highlight w:val="yellow"/>
         </w:rPr>
       </w:r>
     </w:p>
@@ -21535,7 +21542,6 @@
           <w:bCs/>
           <w:szCs w:val="28"/>
           <w:highlight w:val="yellow"/>
-          <w:lang w:val="en-US"/>
         </w:rPr>
       </w:r>
     </w:p>
@@ -21583,7 +21589,6 @@
         <w:rPr>
           <w:szCs w:val="28"/>
           <w:highlight w:val="none"/>
-          <w:lang w:val="en-US"/>
         </w:rPr>
       </w:r>
     </w:p>
@@ -21833,7 +21838,6 @@
         <w:rPr>
           <w:szCs w:val="28"/>
           <w:highlight w:val="yellow"/>
-          <w:lang w:val="en-US"/>
         </w:rPr>
       </w:r>
     </w:p>
@@ -22087,7 +22091,6 @@
         <w:rPr>
           <w:szCs w:val="28"/>
           <w:highlight w:val="yellow"/>
-          <w:lang w:val="en-US"/>
         </w:rPr>
       </w:r>
     </w:p>
@@ -22341,7 +22344,6 @@
         <w:rPr>
           <w:szCs w:val="28"/>
           <w:highlight w:val="yellow"/>
-          <w:lang w:val="en-US"/>
         </w:rPr>
       </w:r>
     </w:p>
@@ -22555,7 +22557,6 @@
           <w:b/>
           <w:szCs w:val="28"/>
           <w:highlight w:val="yellow"/>
-          <w:lang w:val="en-US"/>
         </w:rPr>
       </w:r>
     </w:p>
@@ -23634,7 +23635,6 @@
       <w:r>
         <w:rPr>
           <w:szCs w:val="28"/>
-          <w:highlight w:val="yellow"/>
           <w:lang w:val="en-US"/>
         </w:rPr>
       </w:r>

</xml_diff>